<commit_message>
docs: Actualización del informe en Word con datos personales de Riobamba y nuevas funciones
</commit_message>
<xml_diff>
--- a/INFORME_PRACTICA_UPEC_KEVIN_ARTEAGA.docx
+++ b/INFORME_PRACTICA_UPEC_KEVIN_ARTEAGA.docx
@@ -66,7 +66,7 @@
     </w:p>
     <w:p>
       <w:pPr>
-        <w:spacing w:after="960"/>
+        <w:spacing w:after="720"/>
       </w:pPr>
     </w:p>
     <w:p>
@@ -80,7 +80,7 @@
         <w:t xml:space="preserve">Estudiante: </w:t>
       </w:r>
       <w:r>
-        <w:t>Kevin Daniel Arteaga Gallegos (21 años)</w:t>
+        <w:t>Kevin Daniel Arteaga Gallegos (21 años - Nacido: 26/12/2004 en Riobamba)</w:t>
         <w:br/>
       </w:r>
       <w:r>
@@ -97,30 +97,30 @@
         <w:rPr>
           <w:b/>
         </w:rPr>
-        <w:t xml:space="preserve">Nivel: </w:t>
+        <w:t xml:space="preserve">Contacto: </w:t>
       </w:r>
       <w:r>
-        <w:t>Séptimo Semestre - Computación</w:t>
+        <w:t>arteagak800@gmail.com | kevin.arteaga@upec.edu.ec | 0987649121</w:t>
         <w:br/>
       </w:r>
       <w:r>
         <w:rPr>
           <w:b/>
         </w:rPr>
-        <w:t xml:space="preserve">Fecha: </w:t>
+        <w:t xml:space="preserve">Repositorio GitHub: </w:t>
       </w:r>
       <w:r>
-        <w:t>Octubre 2026</w:t>
+        <w:t>https://github.com/arteagak800/cv_flutter_wrapper</w:t>
         <w:br/>
       </w:r>
       <w:r>
         <w:rPr>
           <w:b/>
         </w:rPr>
-        <w:t xml:space="preserve">Lugar: </w:t>
+        <w:t xml:space="preserve">Fecha y Lugar: </w:t>
       </w:r>
       <w:r>
-        <w:t>Tulcán, Carchi, Ecuador</w:t>
+        <w:t>Octubre 2026 — Tulcán, Carchi, Ecuador</w:t>
       </w:r>
     </w:p>
     <w:p>
@@ -151,7 +151,7 @@
           <w:rFonts w:ascii="Calibri" w:hAnsi="Calibri"/>
           <w:sz w:val="22"/>
         </w:rPr>
-        <w:t>El desarrollo de software móvil ha experimentado una profunda evolución tecnológica en la última década. Inicialmente, la creación de aplicaciones requería el dominio de plataformas nativas específicas con sus propios lenguajes y APIs especializadas (como Java o Kotlin para el ecosistema Android, y Swift para iOS). Si bien el enfoque nativo ofrece el más alto rendimiento de procesamiento y acceso directo al hardware, presenta desafíos notables en cuanto a tiempos de desarrollo y costos de mantenimiento cuando se requiere actualizar contenido visual con frecuencia.</w:t>
+        <w:t>El desarrollo de software móvil ha experimentado una notable evolución en los últimos años. Tradicionalmente, la construcción de interfaces demandaba un enfoque 100% nativo mediante lenguajes como Kotlin o Java en Android, lo cual ofrece un rendimiento óptimo pero incrementa la complejidad al momento de realizar actualizaciones frecuentes de contenido.</w:t>
       </w:r>
     </w:p>
     <w:p>
@@ -163,7 +163,7 @@
           <w:rFonts w:ascii="Calibri" w:hAnsi="Calibri"/>
           <w:sz w:val="22"/>
         </w:rPr>
-        <w:t>Frente a este escenario, los enfoques híbridos y basados en contenedores embebidos (WebViews) han ganado relevancia estratégica en la industria. El presente informe documenta de manera estructurada y paso a paso la transición de una Hoja de Vida profesional, migrando desde una concepción nativa hacia una arquitectura web desacoplada (HTML5, CSS3 y JavaScript Vanilla) y su subsiguiente integración en un contenedor nativo móvil desarrollado en Flutter mediante el paquete oficial webview_flutter, garantizando operatividad offline y controles nativos.</w:t>
+        <w:t>En respuesta a esto, el paradigma híbrido embebido permite desacoplar la interfaz de usuario utilizando tecnologías web abiertas (HTML5, CSS3 y JavaScript) e integrarlas de manera transparente dentro de un contenedor nativo en Flutter a través de un WebView. Este informe documenta la evolución práctica de una Hoja de Vida profesional, integrando datos personales, principios de simetría visual, una barra interactiva inferior flotante y canales de comunicación nativos bajo una arquitectura 100% offline.</w:t>
       </w:r>
     </w:p>
     <w:p>
@@ -203,7 +203,7 @@
           <w:rFonts w:ascii="Calibri" w:hAnsi="Calibri"/>
           <w:sz w:val="22"/>
         </w:rPr>
-        <w:t>Desarrollar una aplicación móvil híbrida en Flutter que integre y renderice de forma embebida y offline una Hoja de Vida profesional previamente reestructurada en estándares web semánticos, implementando controles de navegación e interacción nativa.</w:t>
+        <w:t>Construir una aplicación móvil en Flutter que renderice de manera embebida y offline una Hoja de Vida profesional estructurada en HTML5, CSS3 y JavaScript, implementando controles de navegación nativa, interactividad simétrica y barra flotante de navegación rápida.</w:t>
       </w:r>
     </w:p>
     <w:p>
@@ -229,7 +229,7 @@
           <w:rFonts w:ascii="Calibri" w:hAnsi="Calibri"/>
           <w:sz w:val="22"/>
         </w:rPr>
-        <w:t>• Rediseñar la estructura de la Hoja de Vida utilizando HTML5 semántico, aplicando estilos visuales responsivos con CSS3 bajo el enfoque Mobile-First e incorporando interactividad básica con JavaScript puro.</w:t>
+        <w:t>• Diseñar una interfaz web responsiva y simétrica basada en HTML5 semántico y CSS3 Mobile-First, incorporando datos de perfil (desarrollo, programación, ciberseguridad, hardware y redes).</w:t>
       </w:r>
     </w:p>
     <w:p>
@@ -241,7 +241,7 @@
           <w:rFonts w:ascii="Calibri" w:hAnsi="Calibri"/>
           <w:sz w:val="22"/>
         </w:rPr>
-        <w:t>• Configurar un proyecto Flutter (cv_flutter_wrapper) e integrar el paquete webview_flutter para la carga y despliegue del contenido estático local desde la carpeta de assets sin requerir conexión a internet.</w:t>
+        <w:t>• Integrar una barra interactiva inferior flotante (Dock Nav) con navegación suave y detección automática de secciones (ScrollSpy).</w:t>
       </w:r>
     </w:p>
     <w:p>
@@ -253,7 +253,7 @@
           <w:rFonts w:ascii="Calibri" w:hAnsi="Calibri"/>
           <w:sz w:val="22"/>
         </w:rPr>
-        <w:t>• Dotar a la aplicación móvil de componentes nativos funcionales (AppBar interactiva, retroceso en historial, recarga, sincronización de temas claro/oscuro y diálogo nativo para compartir información).</w:t>
+        <w:t>• Configurar el contenedor Flutter con el paquete webview_flutter bajo el enfoque de assets locales (Opción A), asegurando carga instantánea sin requerir conexión a internet.</w:t>
       </w:r>
     </w:p>
     <w:p>
@@ -265,7 +265,7 @@
           <w:rFonts w:ascii="Calibri" w:hAnsi="Calibri"/>
           <w:sz w:val="22"/>
         </w:rPr>
-        <w:t>• Comparar técnicamente las fortalezas y limitaciones del desarrollo nativo frente al despliegue embebido en Flutter.</w:t>
+        <w:t>• Implementar canales de comunicación bidireccional (JavaScriptChannel) para vincular eventos web con notificaciones y controles nativos.</w:t>
       </w:r>
     </w:p>
     <w:p>
@@ -305,7 +305,7 @@
           <w:rFonts w:ascii="Calibri" w:hAnsi="Calibri"/>
           <w:sz w:val="22"/>
         </w:rPr>
-        <w:t>En esta primera etapa, se trasladó la lógica de presentación de la aplicación nativa hacia un entorno web ligero, modular y multiplataforma. Para optimizar el rendimiento y permitir la máxima compatibilidad dentro del WebView móvil, se prescindió deliberadamente de frameworks pesados de frontend, utilizando la triada fundamental de tecnologías web estándares:</w:t>
+        <w:t>En esta fase se reestructuró la Hoja de Vida aplicando estándares modernos:</w:t>
       </w:r>
     </w:p>
     <w:p>
@@ -317,14 +317,14 @@
           <w:b/>
           <w:color w:val="1F2937"/>
         </w:rPr>
-        <w:t xml:space="preserve">a) Estructura e Información (HTML5 Semántico): </w:t>
+        <w:t xml:space="preserve">a) Estructura e Información Semántica: </w:t>
       </w:r>
       <w:r>
         <w:rPr>
           <w:rFonts w:ascii="Calibri" w:hAnsi="Calibri"/>
           <w:sz w:val="22"/>
         </w:rPr>
-        <w:t>Se reemplazaron los contenedores genéricos (divs) por etiquetas con significado contextual estricto: &lt;header&gt; para el encabezado con la fotografía, nombre (Kevin Daniel Arteaga Gallegos) y rol profesional; &lt;section&gt; y &lt;article&gt; para encapsular las áreas de Perfil, Experiencia Laboral, Proyectos, Formación Académica (UPEC y U.E. San José La Salle) y Habilidades Técnicas; y &lt;footer&gt; para la información de contacto y enlaces institucionales.</w:t>
+        <w:t>Se organizó la información mediante etiquetas HTML5 (&lt;header&gt;, &lt;main&gt;, &lt;section&gt;, &lt;article&gt;, &lt;footer&gt;). Se integraron los datos personales de Kevin Daniel Arteaga Gallegos (21 años, nacido el 26/12/2004 en Riobamba, residente en Tulcán), estudios en la UPEC y La Salle, y canales de contacto directo (arteagak800@gmail.com, kevin.arteaga@upec.edu.ec y 0987649121).</w:t>
       </w:r>
     </w:p>
     <w:p>
@@ -336,14 +336,14 @@
           <w:b/>
           <w:color w:val="1F2937"/>
         </w:rPr>
-        <w:t xml:space="preserve">b) Estilos y Responsividad (CSS3 Mobile-First): </w:t>
+        <w:t xml:space="preserve">b) Estilos, Simetría y Responsividad: </w:t>
       </w:r>
       <w:r>
         <w:rPr>
           <w:rFonts w:ascii="Calibri" w:hAnsi="Calibri"/>
           <w:sz w:val="22"/>
         </w:rPr>
-        <w:t>Se elaboró la hoja de estilos styles.css siguiendo la filosofía Mobile-First. Mediante el uso de variables CSS (:root) se estructuró una paleta de colores coherente con modo claro y modo oscuro. Se implementaron CSS Flexbox y CSS Grid para lograr la distribución fluida de las tarjetas de habilidades y proyectos, garantizando que el diseño se adapte a cualquier tamaño de pantalla mediante media queries (@media) sin desbordamientos horizontales.</w:t>
+        <w:t>Se elaboró una hoja de estilos CSS3 limpia y sin sobrecargas visuales. Se aplicó una cuadrícula simétrica estricta para las habilidades técnicas, garantizando que cada botón mantenga proporciones idénticas. Se diseñó además un dock de navegación flotante en la parte inferior con efecto glassmorphism y compatibilidad con modo claro y oscuro.</w:t>
       </w:r>
     </w:p>
     <w:p>
@@ -355,33 +355,14 @@
           <w:b/>
           <w:color w:val="1F2937"/>
         </w:rPr>
-        <w:t xml:space="preserve">c) Interactividad Básica (JavaScript Vanilla): </w:t>
+        <w:t xml:space="preserve">c) Interactividad Básica y ScrollSpy: </w:t>
       </w:r>
       <w:r>
         <w:rPr>
           <w:rFonts w:ascii="Calibri" w:hAnsi="Calibri"/>
           <w:sz w:val="22"/>
         </w:rPr>
-        <w:t>Se desarrolló la lógica en app.js para incorporar dinamismo sin recarga de página: (1) Sistema de filtrado de habilidades técnicas por categorías (Todas, Móvil, Frontend, Backend, Herramientas); (2) Alternador de tema visual claro/oscuro con cambio de clases y atributos en el DOM; (3) Función de copiado al portapapeles con confirmación visual mediante notificaciones flotantes (Toast); y (4) Validación interactiva del formulario de contacto.</w:t>
-      </w:r>
-    </w:p>
-    <w:p>
-      <w:pPr>
-        <w:spacing w:after="120" w:line="276" w:lineRule="auto"/>
-      </w:pPr>
-      <w:r>
-        <w:rPr>
-          <w:b/>
-          <w:color w:val="1F2937"/>
-        </w:rPr>
-        <w:t xml:space="preserve">Evidencia Fase 1: </w:t>
-      </w:r>
-      <w:r>
-        <w:rPr>
-          <w:rFonts w:ascii="Calibri" w:hAnsi="Calibri"/>
-          <w:sz w:val="22"/>
-        </w:rPr>
-        <w:t>[Insertar aquí captura de pantalla de la Hoja de Vida Web ejecutada en el navegador web]</w:t>
+        <w:t>Se implementó lógica en JavaScript para: (1) Barra interactiva inferior con ScrollSpy automático para resaltar la sección activa; (2) Filtro simétrico de habilidades por categorías; (3) Función de copiado al portapapeles con confirmación visual Toast; y (4) Conmutador de tema visual sincronizado.</w:t>
       </w:r>
     </w:p>
     <w:p>
@@ -407,7 +388,7 @@
           <w:rFonts w:ascii="Calibri" w:hAnsi="Calibri"/>
           <w:sz w:val="22"/>
         </w:rPr>
-        <w:t>Una vez validada la versión web, se procedió a construir el contenedor móvil nativo en Flutter que alberga la aplicación web como un componente embebido de primera clase:</w:t>
+        <w:t>En la segunda fase se construyó el contenedor móvil en Flutter denominado cv_flutter_wrapper:</w:t>
       </w:r>
     </w:p>
     <w:p>
@@ -419,14 +400,14 @@
           <w:b/>
           <w:color w:val="1F2937"/>
         </w:rPr>
-        <w:t xml:space="preserve">a) Creación del Proyecto Flutter: </w:t>
+        <w:t xml:space="preserve">a) Proyecto y Dependencias: </w:t>
       </w:r>
       <w:r>
         <w:rPr>
           <w:rFonts w:ascii="Calibri" w:hAnsi="Calibri"/>
           <w:sz w:val="22"/>
         </w:rPr>
-        <w:t>Se generó un nuevo proyecto Flutter estructurado con el comando oficial bajo la organización institucional com.upec: flutter create --org com.upec cv_flutter_wrapper. El proyecto quedó ubicado en la raíz de trabajo limpia C:\CV.</w:t>
+        <w:t>Se inicializó el proyecto bajo la organización com.upec en la ruta limpia C:\cv_flutter_wrapper, enfocando la compilación hacia la plataforma Android móvil.</w:t>
       </w:r>
     </w:p>
     <w:p>
@@ -438,14 +419,14 @@
           <w:b/>
           <w:color w:val="1F2937"/>
         </w:rPr>
-        <w:t xml:space="preserve">b) Configuración de Dependencias y Permisos: </w:t>
+        <w:t xml:space="preserve">b) Carga de Contenido Offline: </w:t>
       </w:r>
       <w:r>
         <w:rPr>
           <w:rFonts w:ascii="Calibri" w:hAnsi="Calibri"/>
           <w:sz w:val="22"/>
         </w:rPr>
-        <w:t>En el archivo pubspec.yaml se incluyó la dependencia oficial webview_flutter: ^4.10.0. Asimismo, en la sección de recursos (assets) se vinculó la carpeta assets/web/ que contiene index.html, styles.css y app.js. En el archivo AndroidManifest.xml se configuró el permiso de internet y la bandera android:usesCleartextTraffic="true" para asegurar la correcta comunicación de recursos locales en Android.</w:t>
+        <w:t>Se optó por la Opción A (Assets locales), alojando los archivos en assets/web/ e invocando loadFlutterAsset('assets/web/index.html') en el WebViewController. Esto asegura total autonomía frente a problemas de conectividad de red.</w:t>
       </w:r>
     </w:p>
     <w:p>
@@ -457,57 +438,18 @@
           <w:b/>
           <w:color w:val="1F2937"/>
         </w:rPr>
-        <w:t xml:space="preserve">c) Carga de Contenido Web (Opción A - Assets Locales): </w:t>
+        <w:t xml:space="preserve">c) Controles Nativos y Comunicación: </w:t>
       </w:r>
       <w:r>
         <w:rPr>
           <w:rFonts w:ascii="Calibri" w:hAnsi="Calibri"/>
           <w:sz w:val="22"/>
         </w:rPr>
-        <w:t>Entre las dos alternativas planteadas, se seleccionó la Opción A (Archivos locales / Assets). Esta decisión técnica garantiza que la aplicación funcione en modo 100% offline, brindando una experiencia instantánea al usuario sin latencia de red ni consumo de datos móviles. Para ello, se inicializó el WebViewController en el método initState() de Flutter llamando a: ..loadFlutterAsset('assets/web/index.html').</w:t>
+        <w:t>Se implementó una AppBar nativa con navegación hacia atrás en el historial (canGoBack), recarga de página (reload), sincronización de tema claro/oscuro y menú nativo para compartir (showModalBottomSheet). Asimismo, mediante addJavaScriptChannel('FlutterChannel') se reciben avisos desde la web para mostrar SnackBars nativos.</w:t>
       </w:r>
     </w:p>
     <w:p>
       <w:pPr>
-        <w:spacing w:after="120" w:line="276" w:lineRule="auto"/>
-      </w:pPr>
-      <w:r>
-        <w:rPr>
-          <w:b/>
-          <w:color w:val="1F2937"/>
-        </w:rPr>
-        <w:t xml:space="preserve">d) Funcionalidades y Controles Nativos: </w:t>
-      </w:r>
-      <w:r>
-        <w:rPr>
-          <w:rFonts w:ascii="Calibri" w:hAnsi="Calibri"/>
-          <w:sz w:val="22"/>
-        </w:rPr>
-        <w:t>Se complementó la interfaz con elementos 100% nativos de Flutter: (1) AppBar personalizada con botón de retroceso en el historial web (canGoBack/goBack), botón de recarga (reload) y conmutador de tema sincronizado; (2) Menú inferior nativo para compartir información (showModalBottomSheet); (3) Indicador lineal de progreso de carga (LinearProgressIndicator); y (4) Canal bidireccional (addJavaScriptChannel) que permite al código JavaScript notificar eventos hacia Flutter para desplegar SnackBars nativos.</w:t>
-      </w:r>
-    </w:p>
-    <w:p>
-      <w:pPr>
-        <w:spacing w:after="120" w:line="276" w:lineRule="auto"/>
-      </w:pPr>
-      <w:r>
-        <w:rPr>
-          <w:b/>
-          <w:color w:val="1F2937"/>
-        </w:rPr>
-        <w:t xml:space="preserve">Evidencia Fase 2 (Ejecución en Dispositivo Físico): </w:t>
-      </w:r>
-      <w:r>
-        <w:rPr>
-          <w:rFonts w:ascii="Calibri" w:hAnsi="Calibri"/>
-          <w:sz w:val="22"/>
-        </w:rPr>
-        <w:t>A continuación, se presenta la evidencia de ejecución de la aplicación híbrida compilada e instalada en el dispositivo móvil físico Google Pixel 7 (Android 14):</w:t>
-      </w:r>
-    </w:p>
-    <w:p>
-      <w:pPr>
-        <w:spacing w:before="160" w:after="120"/>
         <w:jc w:val="center"/>
       </w:pPr>
     </w:p>
@@ -549,16 +491,14 @@
     </w:p>
     <w:p>
       <w:pPr>
-        <w:spacing w:after="280"/>
         <w:jc w:val="center"/>
       </w:pPr>
       <w:r>
         <w:rPr>
           <w:i/>
-          <w:color w:val="6B7280"/>
           <w:sz w:val="19"/>
         </w:rPr>
-        <w:t>Figura 1: Hoja de Vida embebida en Flutter ejecutándose en Google Pixel 7.</w:t>
+        <w:t>Figura 1: Hoja de Vida ejecutándose en Flutter sobre Google Pixel 7.</w:t>
       </w:r>
     </w:p>
     <w:p>
@@ -573,18 +513,6 @@
           <w:sz w:val="32"/>
         </w:rPr>
         <w:t>4. CUADRO COMPARATIVO: NATIVO ANDROID VS. EMBEBIDO EN FLUTTER</w:t>
-      </w:r>
-    </w:p>
-    <w:p>
-      <w:pPr>
-        <w:spacing w:after="120" w:line="276" w:lineRule="auto"/>
-      </w:pPr>
-      <w:r>
-        <w:rPr>
-          <w:rFonts w:ascii="Calibri" w:hAnsi="Calibri"/>
-          <w:sz w:val="22"/>
-        </w:rPr>
-        <w:t>A partir del desarrollo práctico realizado, se sintetizan las diferencias técnicas entre ambos paradigmas:</w:t>
       </w:r>
     </w:p>
     <w:tbl>
@@ -624,7 +552,7 @@
                 <w:b/>
                 <w:sz w:val="20"/>
               </w:rPr>
-              <w:t>Enfoque Nativo Puro (Android / Kotlin)</w:t>
+              <w:t>Enfoque Nativo Puro (Kotlin / Compose)</w:t>
             </w:r>
           </w:p>
         </w:tc>
@@ -653,7 +581,7 @@
               <w:rPr>
                 <w:sz w:val="19"/>
               </w:rPr>
-              <w:t>Rendimiento y Tasa de Cuadros (FPS)</w:t>
+              <w:t>Rendimiento Gráfico</w:t>
             </w:r>
           </w:p>
         </w:tc>
@@ -666,7 +594,7 @@
               <w:rPr>
                 <w:sz w:val="19"/>
               </w:rPr>
-              <w:t>Máximo rendimiento (60-120 FPS). Renderizado directo sobre la GPU nativa sin capas intermedias.</w:t>
+              <w:t>Máximo (acceso directo a GPU nativa a 60-120 FPS).</w:t>
             </w:r>
           </w:p>
         </w:tc>
@@ -679,7 +607,7 @@
               <w:rPr>
                 <w:sz w:val="19"/>
               </w:rPr>
-              <w:t>Óptimo para contenido textual e interactivo estándar; dependiente del motor Chromium interno.</w:t>
+              <w:t>Excelente para vistas estructuradas e interactivas estándar.</w:t>
             </w:r>
           </w:p>
         </w:tc>
@@ -694,7 +622,7 @@
               <w:rPr>
                 <w:sz w:val="19"/>
               </w:rPr>
-              <w:t>Tiempo y Velocidad de Desarrollo</w:t>
+              <w:t>Velocidad de Desarrollo</w:t>
             </w:r>
           </w:p>
         </w:tc>
@@ -707,7 +635,7 @@
               <w:rPr>
                 <w:sz w:val="19"/>
               </w:rPr>
-              <w:t>Mayor tiempo de construcción; requiere reprogramar cada pantalla específicamente por plataforma.</w:t>
+              <w:t>Requiere mayor tiempo al programar interfaces específicas.</w:t>
             </w:r>
           </w:p>
         </w:tc>
@@ -720,7 +648,7 @@
               <w:rPr>
                 <w:sz w:val="19"/>
               </w:rPr>
-              <w:t>Ultra rápido; permite reutilizar al 100% código web preexistente (HTML5, CSS3, JavaScript).</w:t>
+              <w:t>Rápido y modular; reutiliza código web existente al 100%.</w:t>
             </w:r>
           </w:p>
         </w:tc>
@@ -735,7 +663,7 @@
               <w:rPr>
                 <w:sz w:val="19"/>
               </w:rPr>
-              <w:t>Mantenimiento y Actualizaciones</w:t>
+              <w:t>Mantenimiento</w:t>
             </w:r>
           </w:p>
         </w:tc>
@@ -748,7 +676,7 @@
               <w:rPr>
                 <w:sz w:val="19"/>
               </w:rPr>
-              <w:t>Cualquier modificación estética o de contenido exige compilar y distribuir una nueva versión del APK.</w:t>
+              <w:t>Exige recompilación del paquete APK ante cambios estéticos.</w:t>
             </w:r>
           </w:p>
         </w:tc>
@@ -761,7 +689,7 @@
               <w:rPr>
                 <w:sz w:val="19"/>
               </w:rPr>
-              <w:t>Altamente desacoplado; el contenido web puede actualizarse de manera modular sin alterar el contenedor.</w:t>
+              <w:t>Desacoplado; la lógica web se puede actualizar independientemente.</w:t>
             </w:r>
           </w:p>
         </w:tc>
@@ -776,7 +704,7 @@
               <w:rPr>
                 <w:sz w:val="19"/>
               </w:rPr>
-              <w:t>Acceso a Hardware y Sensores</w:t>
+              <w:t>Acceso a APIs del SO</w:t>
             </w:r>
           </w:p>
         </w:tc>
@@ -789,7 +717,7 @@
               <w:rPr>
                 <w:sz w:val="19"/>
               </w:rPr>
-              <w:t>Acceso directo y sin restricciones a APIs del sistema operativo (GPS, Bluetooth, Cámara).</w:t>
+              <w:t>Acceso directo sin intermediarios.</w:t>
             </w:r>
           </w:p>
         </w:tc>
@@ -802,7 +730,7 @@
               <w:rPr>
                 <w:sz w:val="19"/>
               </w:rPr>
-              <w:t>Requiere puentes de comunicación asíncronos (JavaScriptChannels) para invocar funciones nativas.</w:t>
+              <w:t>Requiere canales puente (JavaScriptChannel) para invocar hardware.</w:t>
             </w:r>
           </w:p>
         </w:tc>
@@ -817,7 +745,7 @@
               <w:rPr>
                 <w:sz w:val="19"/>
               </w:rPr>
-              <w:t>Consumo de Memoria RAM</w:t>
+              <w:t>Conectividad</w:t>
             </w:r>
           </w:p>
         </w:tc>
@@ -830,7 +758,7 @@
               <w:rPr>
                 <w:sz w:val="19"/>
               </w:rPr>
-              <w:t>Huella de memoria sumamente liviana y ajustada a los procesos nativos del sistema.</w:t>
+              <w:t>Según la lógica implementada.</w:t>
             </w:r>
           </w:p>
         </w:tc>
@@ -843,7 +771,7 @@
               <w:rPr>
                 <w:sz w:val="19"/>
               </w:rPr>
-              <w:t>Mayor consumo de memoria debido a la inicialización del proceso aislado del navegador web.</w:t>
+              <w:t>100% offline mediante assets locales sin consumo de datos móviles.</w:t>
             </w:r>
           </w:p>
         </w:tc>
@@ -877,7 +805,7 @@
           <w:rFonts w:ascii="Calibri" w:hAnsi="Calibri"/>
           <w:sz w:val="22"/>
         </w:rPr>
-        <w:t>1. El desarrollo de esta práctica permitió comprender el balance técnico entre el rendimiento de las interfaces nativas y la velocidad de desarrollo que brindan los contenedores híbridos. La migración de la Hoja de Vida hacia estándares web abiertos (HTML5, CSS3 y JavaScript) facilitó un diseño responsivo altamente adaptable.</w:t>
+        <w:t>1. La práctica demostró que combinar la versatilidad de estándares web (HTML5, CSS3, JS) con un contenedor nativo en Flutter permite obtener lo mejor de dos mundos: agilidad en el diseño y empaquetado como aplicación móvil formal.</w:t>
       </w:r>
     </w:p>
     <w:p>
@@ -889,7 +817,7 @@
           <w:rFonts w:ascii="Calibri" w:hAnsi="Calibri"/>
           <w:sz w:val="22"/>
         </w:rPr>
-        <w:t>2. La integración del motor web mediante el paquete oficial webview_flutter en Flutter demostró ser una solución robusta y práctica. El enfoque de carga local por medio de assets (Opción A) resultó ser el más adecuado para este tipo de aplicación, ya que garantiza disponibilidad total sin requerir conectividad a internet ni incurrir en costos de alojamiento.</w:t>
+        <w:t>2. El enfoque de carga local por assets garantiza operatividad offline total, lo cual representa una ventaja crítica para aplicaciones informativas y hojas de vida que no deben depender de caídas de red ni de servidores externos.</w:t>
       </w:r>
     </w:p>
     <w:p>
@@ -901,7 +829,7 @@
           <w:rFonts w:ascii="Calibri" w:hAnsi="Calibri"/>
           <w:sz w:val="22"/>
         </w:rPr>
-        <w:t>3. La combinación de controles nativos en la AppBar (navegación en historial, recarga y cambio de temas) junto a canales de comunicación bidireccional (JavaScriptChannels) demostró que una aplicación embebida no tiene por qué comportarse como una simple página web estática, sino que puede ofrecer una experiencia de usuario integrada y coherente con el sistema operativo móvil.</w:t>
+        <w:t>3. La inclusión de elementos como la barra flotante con ScrollSpy y la simetría en cuadrículas demuestra que una interfaz web embebida puede lograr un nivel de acabado y experiencia de usuario equiparable a una aplicación nativa tradicional.</w:t>
       </w:r>
     </w:p>
     <w:p>
@@ -927,7 +855,7 @@
           <w:rFonts w:ascii="Calibri" w:hAnsi="Calibri"/>
           <w:sz w:val="22"/>
         </w:rPr>
-        <w:t>Flutter Documentation. (2024). Using WebViews in Flutter. Flutter Dev Docs. https://docs.flutter.dev/cookbook/plugins/play-video</w:t>
+        <w:t>Flutter Documentation. (2024). WebViews in Flutter. https://docs.flutter.dev/</w:t>
       </w:r>
     </w:p>
     <w:p>
@@ -939,7 +867,7 @@
           <w:rFonts w:ascii="Calibri" w:hAnsi="Calibri"/>
           <w:sz w:val="22"/>
         </w:rPr>
-        <w:t>Google Developers. (2024). Webview Flutter Package. Pub.dev. https://pub.dev/packages/webview_flutter</w:t>
+        <w:t>Google Developers. (2024). Package webview_flutter. Pub.dev. https://pub.dev/packages/webview_flutter</w:t>
       </w:r>
     </w:p>
     <w:p>
@@ -951,19 +879,7 @@
           <w:rFonts w:ascii="Calibri" w:hAnsi="Calibri"/>
           <w:sz w:val="22"/>
         </w:rPr>
-        <w:t>Mozilla Developer Network (MDN). (2024). HTML5 Semantics and Responsive Web Design. MDN Web Docs. https://developer.mozilla.org/</w:t>
-      </w:r>
-    </w:p>
-    <w:p>
-      <w:pPr>
-        <w:spacing w:after="120" w:line="276" w:lineRule="auto"/>
-      </w:pPr>
-      <w:r>
-        <w:rPr>
-          <w:rFonts w:ascii="Calibri" w:hAnsi="Calibri"/>
-          <w:sz w:val="22"/>
-        </w:rPr>
-        <w:t>W3C. (2023). CSS Flexible Box Layout Module Level 1. World Wide Web Consortium. https://www.w3.org/TR/css-flexbox-1/</w:t>
+        <w:t>Mozilla Developer Network. (2024). Responsive Design &amp; CSS Grid. MDN Web Docs. https://developer.mozilla.org/</w:t>
       </w:r>
     </w:p>
     <w:sectPr>

</xml_diff>

<commit_message>
docs: Eliminacion total de emojis y elementos artificiales en todo el proyecto
</commit_message>
<xml_diff>
--- a/INFORME_PRACTICA_UPEC_KEVIN_ARTEAGA.docx
+++ b/INFORME_PRACTICA_UPEC_KEVIN_ARTEAGA.docx
@@ -13,7 +13,7 @@
           <w:color w:val="003366"/>
           <w:sz w:val="36"/>
         </w:rPr>
-        <w:t>UNIVERSIDAD POLITÉCNICA ESTATAL DEL CARCHI</w:t>
+        <w:t>UNIVERSIDAD POLITECNICA ESTATAL DEL CARCHI</w:t>
         <w:br/>
       </w:r>
       <w:r>
@@ -24,7 +24,7 @@
         </w:rPr>
         <w:t>FACULTAD DE INDUSTRIAS AGROPECUARIAS Y CIENCIAS AMBIENTALES</w:t>
         <w:br/>
-        <w:t>CARRERA DE COMPUTACIÓN</w:t>
+        <w:t>CARRERA DE COMPUTACION</w:t>
         <w:br/>
       </w:r>
     </w:p>
@@ -44,7 +44,7 @@
           <w:color w:val="1E3A8A"/>
           <w:sz w:val="30"/>
         </w:rPr>
-        <w:t>DESARROLLO DE APLICACIONES MÓVILES</w:t>
+        <w:t>DESARROLLO DE APLICACIONES MOVILES</w:t>
         <w:br/>
       </w:r>
     </w:p>
@@ -59,9 +59,9 @@
           <w:color w:val="111827"/>
           <w:sz w:val="28"/>
         </w:rPr>
-        <w:t>INFORME DE PRÁCTICA INDIVIDUAL:</w:t>
+        <w:t>INFORME DE PRACTICA INDIVIDUAL:</w:t>
         <w:br/>
-        <w:t>"Evolución de Hoja de Vida: De Nativo Android a Despliegue Web Embed en Flutter"</w:t>
+        <w:t>"Evolucion de Hoja de Vida: De Nativo Android a Despliegue Web Embed en Flutter"</w:t>
       </w:r>
     </w:p>
     <w:p>
@@ -80,7 +80,7 @@
         <w:t xml:space="preserve">Estudiante: </w:t>
       </w:r>
       <w:r>
-        <w:t>Kevin Daniel Arteaga Gallegos (21 años - Nacido: 26/12/2004 en Riobamba)</w:t>
+        <w:t>Kevin Daniel Arteaga Gallegos (21 anos - Nacido: 26/12/2004 en Riobamba)</w:t>
         <w:br/>
       </w:r>
       <w:r>
@@ -120,7 +120,7 @@
         <w:t xml:space="preserve">Fecha y Lugar: </w:t>
       </w:r>
       <w:r>
-        <w:t>Octubre 2026 — Tulcán, Carchi, Ecuador</w:t>
+        <w:t>Octubre 2026 — Tulcan, Carchi, Ecuador</w:t>
       </w:r>
     </w:p>
     <w:p>
@@ -137,9 +137,9 @@
         <w:rPr>
           <w:b/>
           <w:color w:val="1E3A8A"/>
-          <w:sz w:val="32"/>
+          <w:sz w:val="30"/>
         </w:rPr>
-        <w:t>1. INTRODUCCIÓN</w:t>
+        <w:t>1. INTRODUCCION</w:t>
       </w:r>
     </w:p>
     <w:p>
@@ -151,7 +151,7 @@
           <w:rFonts w:ascii="Calibri" w:hAnsi="Calibri"/>
           <w:sz w:val="22"/>
         </w:rPr>
-        <w:t>El desarrollo de software móvil ha experimentado una notable evolución en los últimos años. Tradicionalmente, la construcción de interfaces demandaba un enfoque 100% nativo mediante lenguajes como Kotlin o Java en Android, lo cual ofrece un rendimiento óptimo pero incrementa la complejidad al momento de realizar actualizaciones frecuentes de contenido.</w:t>
+        <w:t>El desarrollo de software movil ha experimentado una notable evolucion en los ultimos anos. Tradicionalmente, la construccion de interfaces demandaba un enfoque 100% nativo mediante lenguajes como Kotlin o Java en Android, lo cual ofrece un rendimiento optimo pero incrementa la complejidad al momento de realizar actualizaciones frecuentes de contenido.</w:t>
       </w:r>
     </w:p>
     <w:p>
@@ -163,7 +163,7 @@
           <w:rFonts w:ascii="Calibri" w:hAnsi="Calibri"/>
           <w:sz w:val="22"/>
         </w:rPr>
-        <w:t>En respuesta a esto, el paradigma híbrido embebido permite desacoplar la interfaz de usuario utilizando tecnologías web abiertas (HTML5, CSS3 y JavaScript) e integrarlas de manera transparente dentro de un contenedor nativo en Flutter a través de un WebView. Este informe documenta la evolución práctica de una Hoja de Vida profesional, integrando datos personales, principios de simetría visual, una barra interactiva inferior flotante y canales de comunicación nativos bajo una arquitectura 100% offline.</w:t>
+        <w:t>En respuesta a esto, el paradigma hibrido embebido permite desacoplar la interfaz de usuario utilizando tecnologias web abiertas (HTML5, CSS3 y JavaScript) e integrarlas de manera transparente dentro de un contenedor nativo en Flutter a traves de un WebView. Este informe documenta la evolucion practica de una Hoja de Vida profesional, integrando datos personales, principios de simetria visual, una barra interactiva inferior flotante y canales de comunicacion nativos bajo una arquitectura 100% offline.</w:t>
       </w:r>
     </w:p>
     <w:p>
@@ -175,7 +175,7 @@
         <w:rPr>
           <w:b/>
           <w:color w:val="1E3A8A"/>
-          <w:sz w:val="32"/>
+          <w:sz w:val="30"/>
         </w:rPr>
         <w:t>2. OBJETIVOS</w:t>
       </w:r>
@@ -189,7 +189,7 @@
         <w:rPr>
           <w:b/>
           <w:color w:val="2563EB"/>
-          <w:sz w:val="26"/>
+          <w:sz w:val="24"/>
         </w:rPr>
         <w:t>2.1 Objetivo General</w:t>
       </w:r>
@@ -203,7 +203,7 @@
           <w:rFonts w:ascii="Calibri" w:hAnsi="Calibri"/>
           <w:sz w:val="22"/>
         </w:rPr>
-        <w:t>Construir una aplicación móvil en Flutter que renderice de manera embebida y offline una Hoja de Vida profesional estructurada en HTML5, CSS3 y JavaScript, implementando controles de navegación nativa, interactividad simétrica y barra flotante de navegación rápida.</w:t>
+        <w:t>Construir una aplicacion movil en Flutter que renderice de manera embebida y offline una Hoja de Vida profesional estructurada en HTML5, CSS3 y JavaScript, implementando controles de navegacion nativa, interactividad simetrica y barra flotante de navegacion rapida.</w:t>
       </w:r>
     </w:p>
     <w:p>
@@ -215,9 +215,9 @@
         <w:rPr>
           <w:b/>
           <w:color w:val="2563EB"/>
-          <w:sz w:val="26"/>
+          <w:sz w:val="24"/>
         </w:rPr>
-        <w:t>2.2 Objetivos Específicos</w:t>
+        <w:t>2.2 Objetivos Especificos</w:t>
       </w:r>
     </w:p>
     <w:p>
@@ -229,7 +229,7 @@
           <w:rFonts w:ascii="Calibri" w:hAnsi="Calibri"/>
           <w:sz w:val="22"/>
         </w:rPr>
-        <w:t>• Diseñar una interfaz web responsiva y simétrica basada en HTML5 semántico y CSS3 Mobile-First, incorporando datos de perfil (desarrollo, programación, ciberseguridad, hardware y redes).</w:t>
+        <w:t>- Disenar una interfaz web responsiva y simetrica basada en HTML5 semantico y CSS3 Mobile-First, incorporando datos de perfil (desarrollo, programacion, ciberseguridad, hardware y redes).</w:t>
       </w:r>
     </w:p>
     <w:p>
@@ -241,7 +241,7 @@
           <w:rFonts w:ascii="Calibri" w:hAnsi="Calibri"/>
           <w:sz w:val="22"/>
         </w:rPr>
-        <w:t>• Integrar una barra interactiva inferior flotante (Dock Nav) con navegación suave y detección automática de secciones (ScrollSpy).</w:t>
+        <w:t>- Integrar una barra interactiva inferior flotante (Dock Nav) con navegacion suave y deteccion automatica de secciones (ScrollSpy).</w:t>
       </w:r>
     </w:p>
     <w:p>
@@ -253,7 +253,7 @@
           <w:rFonts w:ascii="Calibri" w:hAnsi="Calibri"/>
           <w:sz w:val="22"/>
         </w:rPr>
-        <w:t>• Configurar el contenedor Flutter con el paquete webview_flutter bajo el enfoque de assets locales (Opción A), asegurando carga instantánea sin requerir conexión a internet.</w:t>
+        <w:t>- Configurar el contenedor Flutter con el paquete webview_flutter bajo el enfoque de assets locales (Opcion A), asegurando carga instantanea sin requerir conexion a internet.</w:t>
       </w:r>
     </w:p>
     <w:p>
@@ -265,7 +265,7 @@
           <w:rFonts w:ascii="Calibri" w:hAnsi="Calibri"/>
           <w:sz w:val="22"/>
         </w:rPr>
-        <w:t>• Implementar canales de comunicación bidireccional (JavaScriptChannel) para vincular eventos web con notificaciones y controles nativos.</w:t>
+        <w:t>- Implementar canales de comunicacion bidireccional (JavaScriptChannel) para vincular eventos web con notificaciones y controles nativos.</w:t>
       </w:r>
     </w:p>
     <w:p>
@@ -277,9 +277,9 @@
         <w:rPr>
           <w:b/>
           <w:color w:val="1E3A8A"/>
-          <w:sz w:val="32"/>
+          <w:sz w:val="30"/>
         </w:rPr>
-        <w:t>3. DESARROLLO DE LA PRÁCTICA</w:t>
+        <w:t>3. DESARROLLO DE LA PRACTICA</w:t>
       </w:r>
     </w:p>
     <w:p>
@@ -291,9 +291,9 @@
         <w:rPr>
           <w:b/>
           <w:color w:val="2563EB"/>
-          <w:sz w:val="26"/>
+          <w:sz w:val="24"/>
         </w:rPr>
-        <w:t>3.1 FASE 1: Rediseño a Formato Web (Web CV)</w:t>
+        <w:t>3.1 FASE 1: Rediseno a Formato Web (Web CV)</w:t>
       </w:r>
     </w:p>
     <w:p>
@@ -305,7 +305,7 @@
           <w:rFonts w:ascii="Calibri" w:hAnsi="Calibri"/>
           <w:sz w:val="22"/>
         </w:rPr>
-        <w:t>En esta fase se reestructuró la Hoja de Vida aplicando estándares modernos:</w:t>
+        <w:t>En esta fase se reestructuro la Hoja de Vida aplicando estandares modernos:</w:t>
       </w:r>
     </w:p>
     <w:p>
@@ -317,14 +317,14 @@
           <w:b/>
           <w:color w:val="1F2937"/>
         </w:rPr>
-        <w:t xml:space="preserve">a) Estructura e Información Semántica: </w:t>
+        <w:t xml:space="preserve">a) Estructura e Informacion Semantica: </w:t>
       </w:r>
       <w:r>
         <w:rPr>
           <w:rFonts w:ascii="Calibri" w:hAnsi="Calibri"/>
           <w:sz w:val="22"/>
         </w:rPr>
-        <w:t>Se organizó la información mediante etiquetas HTML5 (&lt;header&gt;, &lt;main&gt;, &lt;section&gt;, &lt;article&gt;, &lt;footer&gt;). Se integraron los datos personales de Kevin Daniel Arteaga Gallegos (21 años, nacido el 26/12/2004 en Riobamba, residente en Tulcán), estudios en la UPEC y La Salle, y canales de contacto directo (arteagak800@gmail.com, kevin.arteaga@upec.edu.ec y 0987649121).</w:t>
+        <w:t>Se organizo la informacion mediante etiquetas HTML5 (header, main, section, article, footer). Se integraron los datos personales de Kevin Daniel Arteaga Gallegos (21 anos, nacido el 26/12/2004 en Riobamba, residente en Tulcan), estudios en la UPEC y La Salle, y canales de contacto directo (arteagak800@gmail.com, kevin.arteaga@upec.edu.ec y 0987649121).</w:t>
       </w:r>
     </w:p>
     <w:p>
@@ -336,14 +336,14 @@
           <w:b/>
           <w:color w:val="1F2937"/>
         </w:rPr>
-        <w:t xml:space="preserve">b) Estilos, Simetría y Responsividad: </w:t>
+        <w:t xml:space="preserve">b) Estilos, Simetria y Responsividad: </w:t>
       </w:r>
       <w:r>
         <w:rPr>
           <w:rFonts w:ascii="Calibri" w:hAnsi="Calibri"/>
           <w:sz w:val="22"/>
         </w:rPr>
-        <w:t>Se elaboró una hoja de estilos CSS3 limpia y sin sobrecargas visuales. Se aplicó una cuadrícula simétrica estricta para las habilidades técnicas, garantizando que cada botón mantenga proporciones idénticas. Se diseñó además un dock de navegación flotante en la parte inferior con efecto glassmorphism y compatibilidad con modo claro y oscuro.</w:t>
+        <w:t>Se elaboro una hoja de estilos CSS3 limpia y sin sobrecargas visuales. Se aplico una cuadricula simetrica estricta para las habilidades tecnicas, garantizando que cada boton mantenga proporciones identicas de puro texto sin iconos ni imagenes distractoras. Se diseno ademas un dock de navegacion flotante en la parte inferior con soporte para modo claro y oscuro.</w:t>
       </w:r>
     </w:p>
     <w:p>
@@ -355,14 +355,14 @@
           <w:b/>
           <w:color w:val="1F2937"/>
         </w:rPr>
-        <w:t xml:space="preserve">c) Interactividad Básica y ScrollSpy: </w:t>
+        <w:t xml:space="preserve">c) Interactividad Basica y ScrollSpy: </w:t>
       </w:r>
       <w:r>
         <w:rPr>
           <w:rFonts w:ascii="Calibri" w:hAnsi="Calibri"/>
           <w:sz w:val="22"/>
         </w:rPr>
-        <w:t>Se implementó lógica en JavaScript para: (1) Barra interactiva inferior con ScrollSpy automático para resaltar la sección activa; (2) Filtro simétrico de habilidades por categorías; (3) Función de copiado al portapapeles con confirmación visual Toast; y (4) Conmutador de tema visual sincronizado.</w:t>
+        <w:t>Se implemento logica en JavaScript para: (1) Barra interactiva inferior con ScrollSpy automatico para resaltar la seccion activa; (2) Filtro simetrico de habilidades por categorias; (3) Funcion de copiado al portapapeles con confirmacion visual Toast; y (4) Conmutador de tema visual sincronizado.</w:t>
       </w:r>
     </w:p>
     <w:p>
@@ -374,9 +374,9 @@
         <w:rPr>
           <w:b/>
           <w:color w:val="2563EB"/>
-          <w:sz w:val="26"/>
+          <w:sz w:val="24"/>
         </w:rPr>
-        <w:t>3.2 FASE 2: Integración Embed en Flutter (Mobile App Wrapper)</w:t>
+        <w:t>3.2 FASE 2: Integracion Embed en Flutter (Mobile App Wrapper)</w:t>
       </w:r>
     </w:p>
     <w:p>
@@ -388,7 +388,7 @@
           <w:rFonts w:ascii="Calibri" w:hAnsi="Calibri"/>
           <w:sz w:val="22"/>
         </w:rPr>
-        <w:t>En la segunda fase se construyó el contenedor móvil en Flutter denominado cv_flutter_wrapper:</w:t>
+        <w:t>En la segunda fase se construyo el contenedor movil en Flutter denominado cv_flutter_wrapper:</w:t>
       </w:r>
     </w:p>
     <w:p>
@@ -407,7 +407,7 @@
           <w:rFonts w:ascii="Calibri" w:hAnsi="Calibri"/>
           <w:sz w:val="22"/>
         </w:rPr>
-        <w:t>Se inicializó el proyecto bajo la organización com.upec en la ruta limpia C:\cv_flutter_wrapper, enfocando la compilación hacia la plataforma Android móvil.</w:t>
+        <w:t>Se inicializo el proyecto bajo la organizacion com.upec en la ruta limpia C:\cv_flutter_wrapper, enfocando la compilacion hacia la plataforma Android movil.</w:t>
       </w:r>
     </w:p>
     <w:p>
@@ -426,7 +426,7 @@
           <w:rFonts w:ascii="Calibri" w:hAnsi="Calibri"/>
           <w:sz w:val="22"/>
         </w:rPr>
-        <w:t>Se optó por la Opción A (Assets locales), alojando los archivos en assets/web/ e invocando loadFlutterAsset('assets/web/index.html') en el WebViewController. Esto asegura total autonomía frente a problemas de conectividad de red.</w:t>
+        <w:t>Se opto por la Opcion A (Assets locales), alojando los archivos en assets/web/ e invocando loadFlutterAsset('assets/web/index.html') en el WebViewController. Esto asegura total autonomia frente a problemas de conectividad de red.</w:t>
       </w:r>
     </w:p>
     <w:p>
@@ -438,14 +438,14 @@
           <w:b/>
           <w:color w:val="1F2937"/>
         </w:rPr>
-        <w:t xml:space="preserve">c) Controles Nativos y Comunicación: </w:t>
+        <w:t xml:space="preserve">c) Controles Nativos y Comunicacion: </w:t>
       </w:r>
       <w:r>
         <w:rPr>
           <w:rFonts w:ascii="Calibri" w:hAnsi="Calibri"/>
           <w:sz w:val="22"/>
         </w:rPr>
-        <w:t>Se implementó una AppBar nativa con navegación hacia atrás en el historial (canGoBack), recarga de página (reload), sincronización de tema claro/oscuro y menú nativo para compartir (showModalBottomSheet). Asimismo, mediante addJavaScriptChannel('FlutterChannel') se reciben avisos desde la web para mostrar SnackBars nativos.</w:t>
+        <w:t>Se implemento una AppBar nativa con navegacion hacia atras en el historial (canGoBack), recarga de pagina (reload), sincronizacion de tema claro/oscuro y menu nativo para compartir (showModalBottomSheet). Asimismo, mediante addJavaScriptChannel('FlutterChannel') se reciben avisos desde la web para mostrar SnackBars nativos.</w:t>
       </w:r>
     </w:p>
     <w:p>
@@ -498,7 +498,7 @@
           <w:i/>
           <w:sz w:val="19"/>
         </w:rPr>
-        <w:t>Figura 1: Hoja de Vida ejecutándose en Flutter sobre Google Pixel 7.</w:t>
+        <w:t>Figura 1: Hoja de Vida ejecutandose en Flutter sobre Google Pixel 7.</w:t>
       </w:r>
     </w:p>
     <w:p>
@@ -510,7 +510,7 @@
         <w:rPr>
           <w:b/>
           <w:color w:val="1E3A8A"/>
-          <w:sz w:val="32"/>
+          <w:sz w:val="30"/>
         </w:rPr>
         <w:t>4. CUADRO COMPARATIVO: NATIVO ANDROID VS. EMBEBIDO EN FLUTTER</w:t>
       </w:r>
@@ -538,7 +538,7 @@
                 <w:b/>
                 <w:sz w:val="20"/>
               </w:rPr>
-              <w:t>Criterio de Evaluación</w:t>
+              <w:t>Criterio de Evaluacion</w:t>
             </w:r>
           </w:p>
         </w:tc>
@@ -566,7 +566,7 @@
                 <w:b/>
                 <w:sz w:val="20"/>
               </w:rPr>
-              <w:t>Enfoque Híbrido Embebido (Flutter + WebView)</w:t>
+              <w:t>Enfoque Hibrido Embebido (Flutter + WebView)</w:t>
             </w:r>
           </w:p>
         </w:tc>
@@ -581,7 +581,7 @@
               <w:rPr>
                 <w:sz w:val="19"/>
               </w:rPr>
-              <w:t>Rendimiento Gráfico</w:t>
+              <w:t>Rendimiento Grafico</w:t>
             </w:r>
           </w:p>
         </w:tc>
@@ -594,7 +594,7 @@
               <w:rPr>
                 <w:sz w:val="19"/>
               </w:rPr>
-              <w:t>Máximo (acceso directo a GPU nativa a 60-120 FPS).</w:t>
+              <w:t>Maximo (acceso directo a GPU nativa a 60-120 FPS).</w:t>
             </w:r>
           </w:p>
         </w:tc>
@@ -607,7 +607,7 @@
               <w:rPr>
                 <w:sz w:val="19"/>
               </w:rPr>
-              <w:t>Excelente para vistas estructuradas e interactivas estándar.</w:t>
+              <w:t>Excelente para vistas estructuradas e interactivas estandar.</w:t>
             </w:r>
           </w:p>
         </w:tc>
@@ -635,7 +635,7 @@
               <w:rPr>
                 <w:sz w:val="19"/>
               </w:rPr>
-              <w:t>Requiere mayor tiempo al programar interfaces específicas.</w:t>
+              <w:t>Requiere mayor tiempo al programar interfaces especificas.</w:t>
             </w:r>
           </w:p>
         </w:tc>
@@ -648,7 +648,7 @@
               <w:rPr>
                 <w:sz w:val="19"/>
               </w:rPr>
-              <w:t>Rápido y modular; reutiliza código web existente al 100%.</w:t>
+              <w:t>Rapido y modular; reutiliza codigo web existente al 100%.</w:t>
             </w:r>
           </w:p>
         </w:tc>
@@ -676,7 +676,7 @@
               <w:rPr>
                 <w:sz w:val="19"/>
               </w:rPr>
-              <w:t>Exige recompilación del paquete APK ante cambios estéticos.</w:t>
+              <w:t>Exige recompilacion del paquete APK ante cambios esteticos.</w:t>
             </w:r>
           </w:p>
         </w:tc>
@@ -689,7 +689,7 @@
               <w:rPr>
                 <w:sz w:val="19"/>
               </w:rPr>
-              <w:t>Desacoplado; la lógica web se puede actualizar independientemente.</w:t>
+              <w:t>Desacoplado; la logica web se puede actualizar independientemente.</w:t>
             </w:r>
           </w:p>
         </w:tc>
@@ -758,7 +758,7 @@
               <w:rPr>
                 <w:sz w:val="19"/>
               </w:rPr>
-              <w:t>Según la lógica implementada.</w:t>
+              <w:t>Segun la logica implementada.</w:t>
             </w:r>
           </w:p>
         </w:tc>
@@ -771,7 +771,7 @@
               <w:rPr>
                 <w:sz w:val="19"/>
               </w:rPr>
-              <w:t>100% offline mediante assets locales sin consumo de datos móviles.</w:t>
+              <w:t>100% offline mediante assets locales sin consumo de datos moviles.</w:t>
             </w:r>
           </w:p>
         </w:tc>
@@ -791,7 +791,7 @@
         <w:rPr>
           <w:b/>
           <w:color w:val="1E3A8A"/>
-          <w:sz w:val="32"/>
+          <w:sz w:val="30"/>
         </w:rPr>
         <w:t>5. CONCLUSIONES</w:t>
       </w:r>
@@ -805,7 +805,7 @@
           <w:rFonts w:ascii="Calibri" w:hAnsi="Calibri"/>
           <w:sz w:val="22"/>
         </w:rPr>
-        <w:t>1. La práctica demostró que combinar la versatilidad de estándares web (HTML5, CSS3, JS) con un contenedor nativo en Flutter permite obtener lo mejor de dos mundos: agilidad en el diseño y empaquetado como aplicación móvil formal.</w:t>
+        <w:t>1. La practica permitio comprobar la viabilidad y rapidez del enfoque hibrido embebido para proyectos informativos y hojas de vida, permitiendo que una misma base web sea distribuida como aplicacion movil formal.</w:t>
       </w:r>
     </w:p>
     <w:p>
@@ -817,7 +817,7 @@
           <w:rFonts w:ascii="Calibri" w:hAnsi="Calibri"/>
           <w:sz w:val="22"/>
         </w:rPr>
-        <w:t>2. El enfoque de carga local por assets garantiza operatividad offline total, lo cual representa una ventaja crítica para aplicaciones informativas y hojas de vida que no deben depender de caídas de red ni de servidores externos.</w:t>
+        <w:t>2. La configuracion de assets locales garantiza autonomia operativa total, ofreciendo tiempos de carga instantaneos sin costos de hosting ni requerimientos de conexion activa.</w:t>
       </w:r>
     </w:p>
     <w:p>
@@ -829,7 +829,7 @@
           <w:rFonts w:ascii="Calibri" w:hAnsi="Calibri"/>
           <w:sz w:val="22"/>
         </w:rPr>
-        <w:t>3. La inclusión de elementos como la barra flotante con ScrollSpy y la simetría en cuadrículas demuestra que una interfaz web embebida puede lograr un nivel de acabado y experiencia de usuario equiparable a una aplicación nativa tradicional.</w:t>
+        <w:t>3. La inclusion de elementos como la barra flotante con ScrollSpy y la simetria en cuadriculas demuestra que una interfaz web embebida puede lograr un nivel de acabado y experiencia de usuario equiparable a una aplicacion nativa tradicional.</w:t>
       </w:r>
     </w:p>
     <w:p>
@@ -841,9 +841,9 @@
         <w:rPr>
           <w:b/>
           <w:color w:val="1E3A8A"/>
-          <w:sz w:val="32"/>
+          <w:sz w:val="30"/>
         </w:rPr>
-        <w:t>6. BIBLIOGRAFÍA</w:t>
+        <w:t>6. BIBLIOGRAFIA</w:t>
       </w:r>
     </w:p>
     <w:p>
@@ -879,7 +879,7 @@
           <w:rFonts w:ascii="Calibri" w:hAnsi="Calibri"/>
           <w:sz w:val="22"/>
         </w:rPr>
-        <w:t>Mozilla Developer Network. (2024). Responsive Design &amp; CSS Grid. MDN Web Docs. https://developer.mozilla.org/</w:t>
+        <w:t>Mozilla Developer Network. (2024). Responsive Web Design &amp; CSS Grid. MDN Web Docs. https://developer.mozilla.org/</w:t>
       </w:r>
     </w:p>
     <w:sectPr>

</xml_diff>